<commit_message>
Publish automotive market overview report and charts
</commit_message>
<xml_diff>
--- a/Week1-Automotive-Stock-Market-Analysis/Automotive_Market_Overview_and_Trend_Analysis_Report.docx
+++ b/Week1-Automotive-Stock-Market-Analysis/Automotive_Market_Overview_and_Trend_Analysis_Report.docx
@@ -42,7 +42,7 @@
     </w:p>
     <w:p>
       <w:r>
-        <w:t>This report reviews the Indian automotive equity sector using daily historical price data downloaded on 13 October 2026. The market-data analysis includes Nifty 50 and an equal-weighted auto-stock sample basket built from 11 listed manufacturers/component businesses where sufficient data were available. Yahoo Finance returned only one usable ^CNXAUTO observation during this run, so the official Nifty Auto index was not used for historical-return calculations. The most recent common price observation in the downloaded data is 12 October 2026. Over the one-year measured window, Nifty Auto returned 4.3% versus -11.4% for Nifty 50; over the available five-year window, the respective returns were 187.9% and 23.1%. Among included individual shares, the highest observed one-year return was Bharat Forge (48.7%), and the lowest was Maruti Suzuki (-30.0%). These are historical, sample-dependent outcomes, not forecasts or recommendations.</w:t>
+        <w:t>This report reviews the Indian automotive equity sector using daily historical price data downloaded on 13 October 2026. The market-data analysis includes Nifty 50 and an equal-weighted auto-stock sample basket built from 10 listed manufacturers/component businesses where sufficient data were available. Yahoo Finance returned only one usable ^CNXAUTO observation during this run, so the official Nifty Auto index was not used for historical-return calculations. The most recent common price observation in the downloaded data is 12 October 2026. Over the one-year measured window, Nifty Auto returned 4.3% versus -11.4% for Nifty 50; over the available five-year window, the respective returns were 187.9% and 23.1%. Among included individual shares, the highest observed one-year return was Bharat Forge (48.7%), and the lowest was Maruti Suzuki (-30.0%). These are historical, sample-dependent outcomes, not forecasts or recommendations.</w:t>
       </w:r>
     </w:p>
     <w:p>
@@ -63,7 +63,7 @@
         <w:pStyle w:val="ListBullet"/>
       </w:pPr>
       <w:r>
-        <w:t>Benchmark check: Nifty Auto 1Y return 4.3% compared with Nifty 50 -11.4%; the gap matters when deciding whether a stock's return is sector-specific or market-wide.</w:t>
+        <w:t>Benchmark check: Auto sample basket 1Y return 4.3% compared with Nifty 50 -11.4%; the gap helps distinguish the selected sample's performance from the broad market.</w:t>
       </w:r>
     </w:p>
     <w:p>
@@ -108,7 +108,7 @@
     </w:p>
     <w:p>
       <w:r>
-        <w:t>The task is to analyze public information about India's automotive stock market, identify trends and industry factors, visualize evidence, and explain how those factors can influence listed auto companies. The scope covers the Nifty Auto index, the broad Nifty 50 comparator, passenger vehicles, two- and three-wheelers, commercial vehicles, selected component suppliers and batteries. The company sample is deliberately representative rather than an exhaustive stock universe; it is not a recommendation list.</w:t>
+        <w:t>The task is to analyze public information about India's automotive stock market, identify trends and industry factors, visualize evidence, and explain how those factors can influence listed auto companies. The research reviews Nifty Auto as the official sector-index reference and Nifty 50 as the broad-market benchmark. For five-year historical comparison, the report uses an equal-weighted basket of the included listed auto shares because Yahoo's ^CNXAUTO feed supplied only one usable observation. The sample covers passenger vehicles, two- and three-wheelers, commercial vehicles, selected component suppliers and batteries and is not an exhaustive stock universe or a recommendation list.</w:t>
       </w:r>
     </w:p>
     <w:p>
@@ -468,7 +468,7 @@
     </w:p>
     <w:p>
       <w:r>
-        <w:t>Shows how far the Nifty Auto and Nifty 50 moved below prior peaks. Drawdowns help communicate the lived path of risk, which a single return number hides.</w:t>
+        <w:t>Shows how far the equal-weighted auto-stock sample basket and Nifty 50 moved below prior peaks. Drawdowns help communicate the lived path of risk, which a single return number hides.</w:t>
       </w:r>
     </w:p>
     <w:p>
@@ -533,7 +533,7 @@
         <w:pStyle w:val="Heading2"/>
       </w:pPr>
       <w:r>
-        <w:t>Figure 6. Nifty Auto Monthly Return Heatmap</w:t>
+        <w:t>Figure 6. Auto Sample Basket Monthly Return Heatmap</w:t>
       </w:r>
     </w:p>
     <w:p>
@@ -577,7 +577,7 @@
     </w:p>
     <w:p>
       <w:r>
-        <w:t>Highlights calendar periods of positive and negative sector returns without assuming that a seasonality pattern will repeat.</w:t>
+        <w:t>Highlights calendar periods of positive and negative returns in the selected auto-stock basket without assuming that a seasonality pattern will repeat.</w:t>
       </w:r>
     </w:p>
     <w:p>
@@ -941,7 +941,12 @@
     </w:p>
     <w:p>
       <w:r>
-        <w:t>Market data run metadata: {"generated_at_local": "2026-10-13T18:47:17+00:00", "data_source": "Yahoo Finance via yfinance public historical interface", "download_period_requested": "5y", "observed_start": "2021-10-13", "observed_end": "2026-10-12", "tickers_available": {"^NSEI": {"name": "Nifty 50", "category": "Broad-market index", "first_observation": "2021-10-13", "last_observation": "2026-10-12", "n_observations": 1234}, "MARUTI.NS": {"name": "Maruti Suzuki", "category": "Passenger vehicles", "first_observation": "2021-10-13", "last_observation": "2026-10-12", "n_observations": 1235}, "M&amp;M.NS": {"name": "Mahindra &amp; Mahindra", "category": "SUVs, LCVs and tractors", "first_observation": "2021-10-13", "last_observation": "2026-10-12", "n_observations": 1235}, "BAJAJ-AUTO.NS": {"name": "Bajaj Auto", "category": "Two/three-wheelers and exports", "first_observation": "2021-10-13", "last_observation": "2026-10-12", "n_observations": 1235}, "EICHERMOT.NS": {"name": "Eicher Motors", "category": "Motorcycles and commercial vehicles", "first_observation": "2021-10-13", "last_observation": "2026-10-12", "n_observations": 1235}, "HEROMOTOCO.NS": {"name": "Hero MotoCorp", "category": "Two-wheelers", "first_observation": "2021-10-13", "last_observation": "2026-10-12", "n_observations": 1235}, "TVSMOTOR.NS": {"name": "TVS Motor", "category": "Two/three-wheelers", "first_observation": "2021-10-13", "last_observation": "2026-10-12", "n_observations": 1235}, "ASHOKLEY.NS": {"name": "Ashok Leyland", "category": "Commercial vehicles", "first_observation": "2021-10-13", "last_observation": "2026-10-12", "n_observations": 1235}, "BHARATFORG.NS": {"name": "Bharat Forge", "category": "Auto components and industrial forging", "first_observation": "2021-10-13", "last_observation": "2026-10-12", "n_observations": 1234}, "BOSCHLTD.NS": {"name": "Bosch", "category": "Automotive technology and components", "first_observation": "2021-10-13", "last_observation": "2026-10-12", "n_observations": 1235}, "EXIDEIND.NS": {"name": "Exide Industries", "category": "Batteries", "first_observation": "2021-10-13", "last_observation": "2026-10-12", "n_observations": 1235}}, "synthetic_data_used": false, "charts_generated": ["01_sector_vs_broad_market.png", "02_company_relative_returns.png", "03_risk_return_map.png", "04_benchmark_drawdowns.png", "05_daily_return_correlation.png", "06_sector_monthly_return_heatmap.png", "07_recent_relative_trend.png"]}</w:t>
+        <w:t>[S10] Nifty Indices, Nifty Auto index overview and methodology. Nifty Auto is an Indian automotive-sector index calculated using free-float market capitalization. This report does not calculate historical official-index returns because Yahoo returned only one usable observation for its ^CNXAUTO symbol in this run; instead it uses a clearly labeled equally weighted basket of the included stock sample. URL: https://www.niftyindices.com/indices/equity/sectoral-indices/nifty-auto</w:t>
+      </w:r>
+    </w:p>
+    <w:p>
+      <w:r>
+        <w:t>Market data run metadata: {"generated_at_local": "2026-10-13T18:47:53+00:00", "data_source": "Yahoo Finance via yfinance public historical interface", "download_period_requested": "5y", "observed_start": "2021-10-13", "observed_end": "2026-10-12", "tickers_available": {"^NSEI": {"name": "Nifty 50", "category": "Broad-market index", "first_observation": "2021-10-13", "last_observation": "2026-10-12", "n_observations": 1234}, "MARUTI.NS": {"name": "Maruti Suzuki", "category": "Passenger vehicles", "first_observation": "2021-10-13", "last_observation": "2026-10-12", "n_observations": 1235}, "M&amp;M.NS": {"name": "Mahindra &amp; Mahindra", "category": "SUVs, LCVs and tractors", "first_observation": "2021-10-13", "last_observation": "2026-10-12", "n_observations": 1235}, "BAJAJ-AUTO.NS": {"name": "Bajaj Auto", "category": "Two/three-wheelers and exports", "first_observation": "2021-10-13", "last_observation": "2026-10-12", "n_observations": 1235}, "EICHERMOT.NS": {"name": "Eicher Motors", "category": "Motorcycles and commercial vehicles", "first_observation": "2021-10-13", "last_observation": "2026-10-12", "n_observations": 1235}, "HEROMOTOCO.NS": {"name": "Hero MotoCorp", "category": "Two-wheelers", "first_observation": "2021-10-13", "last_observation": "2026-10-12", "n_observations": 1235}, "TVSMOTOR.NS": {"name": "TVS Motor", "category": "Two/three-wheelers", "first_observation": "2021-10-13", "last_observation": "2026-10-12", "n_observations": 1235}, "ASHOKLEY.NS": {"name": "Ashok Leyland", "category": "Commercial vehicles", "first_observation": "2021-10-13", "last_observation": "2026-10-12", "n_observations": 1235}, "BHARATFORG.NS": {"name": "Bharat Forge", "category": "Auto components and industrial forging", "first_observation": "2021-10-13", "last_observation": "2026-10-12", "n_observations": 1234}, "BOSCHLTD.NS": {"name": "Bosch", "category": "Automotive technology and components", "first_observation": "2021-10-13", "last_observation": "2026-10-12", "n_observations": 1235}, "EXIDEIND.NS": {"name": "Exide Industries", "category": "Batteries", "first_observation": "2021-10-13", "last_observation": "2026-10-12", "n_observations": 1235}}, "synthetic_data_used": false, "charts_generated": ["01_sector_vs_broad_market.png", "02_company_relative_returns.png", "03_risk_return_map.png", "04_benchmark_drawdowns.png", "05_daily_return_correlation.png", "06_sector_monthly_return_heatmap.png", "07_recent_relative_trend.png"]}</w:t>
       </w:r>
     </w:p>
     <w:sectPr>

</xml_diff>